<commit_message>
Add information about piazza and gradescope to intro slides
</commit_message>
<xml_diff>
--- a/SOFTWARE ENGINEERING/Course Project Materials/0.OverallProjectDescription.docx
+++ b/SOFTWARE ENGINEERING/Course Project Materials/0.OverallProjectDescription.docx
@@ -1003,7 +1003,13 @@
         <w:rPr>
           <w:b/>
         </w:rPr>
-        <w:t>an implementation layer composed of Object-Oriented Classes.</w:t>
+        <w:t>an implementation layer composed of Object-Oriented Classes</w:t>
+      </w:r>
+      <w:r>
+        <w:rPr>
+          <w:b/>
+        </w:rPr>
+        <w:t xml:space="preserve"> in Python or Java.</w:t>
       </w:r>
       <w:r>
         <w:rPr>
@@ -1254,7 +1260,11 @@
         <w:t xml:space="preserve">PRIVATE </w:t>
       </w:r>
       <w:r>
-        <w:t xml:space="preserve">GitHub repository and include its URL in the proposal. You must add the course TA, as a collaborator as well as the respective professor of your registered section. Here are our GitHub usernames: </w:t>
+        <w:t xml:space="preserve">GitHub repository and include its URL in the proposal. You must add the course </w:t>
+      </w:r>
+      <w:r>
+        <w:lastRenderedPageBreak/>
+        <w:t xml:space="preserve">TA, as a collaborator as well as the respective professor of your registered section. Here are our GitHub usernames: </w:t>
       </w:r>
       <w:r>
         <w:rPr>
@@ -1291,7 +1301,6 @@
         <w:rPr>
           <w:i/>
         </w:rPr>
-        <w:lastRenderedPageBreak/>
         <w:t xml:space="preserve"> </w:t>
       </w:r>
     </w:p>
@@ -1632,6 +1641,7 @@
         <w:ind w:right="122" w:hanging="360"/>
       </w:pPr>
       <w:r>
+        <w:lastRenderedPageBreak/>
         <w:t xml:space="preserve">The initial grade for Deliverable 3 will be assigned upon the submission of the first version. </w:t>
       </w:r>
     </w:p>
@@ -1656,7 +1666,6 @@
         <w:ind w:right="122" w:hanging="360"/>
       </w:pPr>
       <w:r>
-        <w:lastRenderedPageBreak/>
         <w:t xml:space="preserve">Your team is expected to submit Version 2 of Deliverable 3 at the culmination of the course (during the submission of Deliverable 5). </w:t>
       </w:r>
     </w:p>
@@ -1964,6 +1973,7 @@
         <w:ind w:right="122" w:hanging="360"/>
       </w:pPr>
       <w:r>
+        <w:lastRenderedPageBreak/>
         <w:t xml:space="preserve">Briefly summarize the technical details about the implementation and testing, including the programming languages and general technology stack used. </w:t>
       </w:r>
       <w:proofErr w:type="gramStart"/>
@@ -1980,11 +1990,7 @@
         <w:t xml:space="preserve"> </w:t>
       </w:r>
       <w:r>
-        <w:t xml:space="preserve"> </w:t>
-      </w:r>
-      <w:r>
-        <w:lastRenderedPageBreak/>
-        <w:t>Conclude</w:t>
+        <w:t xml:space="preserve"> Conclude</w:t>
       </w:r>
       <w:proofErr w:type="gramEnd"/>
       <w:r>

</xml_diff>

<commit_message>
Fix first two lectures
</commit_message>
<xml_diff>
--- a/SOFTWARE ENGINEERING/Course Project Materials/0.OverallProjectDescription.docx
+++ b/SOFTWARE ENGINEERING/Course Project Materials/0.OverallProjectDescription.docx
@@ -872,6 +872,55 @@
       <w:r>
         <w:t xml:space="preserve">For this project, you and your team will propose an original software concept that addresses a specific challenge within the sustainability domain. Your idea should focus on leveraging technology to create impactful and practical solutions that contribute to a more sustainable future. </w:t>
       </w:r>
+      <w:r>
+        <w:t xml:space="preserve"> While the possible options are unlimited some ideas can be:</w:t>
+      </w:r>
+    </w:p>
+    <w:p>
+      <w:pPr>
+        <w:pStyle w:val="ListParagraph"/>
+        <w:numPr>
+          <w:ilvl w:val="0"/>
+          <w:numId w:val="5"/>
+        </w:numPr>
+        <w:ind w:right="122"/>
+      </w:pPr>
+      <w:r>
+        <w:lastRenderedPageBreak/>
+        <w:t xml:space="preserve">Campus Thrift App: Design </w:t>
+      </w:r>
+      <w:r>
+        <w:t xml:space="preserve">and build </w:t>
+      </w:r>
+      <w:r>
+        <w:t>a platform for students to share/repurpose items instead of buying new ones and throwing others away</w:t>
+      </w:r>
+    </w:p>
+    <w:p>
+      <w:pPr>
+        <w:pStyle w:val="ListParagraph"/>
+        <w:numPr>
+          <w:ilvl w:val="0"/>
+          <w:numId w:val="5"/>
+        </w:numPr>
+        <w:ind w:right="122"/>
+      </w:pPr>
+      <w:r>
+        <w:t>Personal carbon footprint tracker and recommendations engine.  Use purchasing records and other activities to track and recommend improvements.</w:t>
+      </w:r>
+    </w:p>
+    <w:p>
+      <w:pPr>
+        <w:pStyle w:val="ListParagraph"/>
+        <w:numPr>
+          <w:ilvl w:val="0"/>
+          <w:numId w:val="5"/>
+        </w:numPr>
+        <w:ind w:right="122"/>
+      </w:pPr>
+      <w:r>
+        <w:t>Solar potential for roofs and other spaces.  Accept geographical coordinates and/or addresses and produce an estimate of solar potential.</w:t>
+      </w:r>
     </w:p>
     <w:p>
       <w:pPr>
@@ -880,7 +929,6 @@
         <w:jc w:val="left"/>
       </w:pPr>
       <w:r>
-        <w:lastRenderedPageBreak/>
         <w:t xml:space="preserve"> </w:t>
       </w:r>
     </w:p>
@@ -1209,6 +1257,7 @@
         <w:ind w:right="122" w:hanging="199"/>
       </w:pPr>
       <w:r>
+        <w:lastRenderedPageBreak/>
         <w:t xml:space="preserve">You will utilize the </w:t>
       </w:r>
       <w:r>
@@ -1260,11 +1309,7 @@
         <w:t xml:space="preserve">PRIVATE </w:t>
       </w:r>
       <w:r>
-        <w:t xml:space="preserve">GitHub repository and include its URL in the proposal. You must add the course </w:t>
-      </w:r>
-      <w:r>
-        <w:lastRenderedPageBreak/>
-        <w:t xml:space="preserve">TA, as a collaborator as well as the respective professor of your registered section. Here are our GitHub usernames: </w:t>
+        <w:t xml:space="preserve">GitHub repository and include its URL in the proposal. You must add the course TA, as a collaborator as well as the respective professor of your registered section. Here are our GitHub usernames: </w:t>
       </w:r>
       <w:r>
         <w:rPr>
@@ -1600,6 +1645,7 @@
         <w:jc w:val="left"/>
       </w:pPr>
       <w:r>
+        <w:lastRenderedPageBreak/>
         <w:t xml:space="preserve"> </w:t>
       </w:r>
     </w:p>
@@ -1641,7 +1687,6 @@
         <w:ind w:right="122" w:hanging="360"/>
       </w:pPr>
       <w:r>
-        <w:lastRenderedPageBreak/>
         <w:t xml:space="preserve">The initial grade for Deliverable 3 will be assigned upon the submission of the first version. </w:t>
       </w:r>
     </w:p>
@@ -1922,6 +1967,7 @@
         <w:ind w:right="122" w:hanging="360"/>
       </w:pPr>
       <w:r>
+        <w:lastRenderedPageBreak/>
         <w:t xml:space="preserve">Each group is allocated 15 minutes for the presentation, followed by a 5-minute Q&amp;A session. </w:t>
       </w:r>
     </w:p>
@@ -1973,7 +2019,6 @@
         <w:ind w:right="122" w:hanging="360"/>
       </w:pPr>
       <w:r>
-        <w:lastRenderedPageBreak/>
         <w:t xml:space="preserve">Briefly summarize the technical details about the implementation and testing, including the programming languages and general technology stack used. </w:t>
       </w:r>
       <w:proofErr w:type="gramStart"/>
@@ -2778,6 +2823,118 @@
     </w:lvl>
   </w:abstractNum>
   <w:abstractNum w:abstractNumId="3" w15:restartNumberingAfterBreak="0">
+    <w:nsid w:val="3FA43BC4"/>
+    <w:multiLevelType w:val="hybridMultilevel"/>
+    <w:tmpl w:val="4D46F3C4"/>
+    <w:lvl w:ilvl="0" w:tplc="EEE4316C">
+      <w:numFmt w:val="bullet"/>
+      <w:lvlText w:val=""/>
+      <w:lvlJc w:val="left"/>
+      <w:pPr>
+        <w:ind w:left="1080" w:hanging="360"/>
+      </w:pPr>
+      <w:rPr>
+        <w:rFonts w:ascii="Symbol" w:eastAsia="Times New Roman" w:hAnsi="Symbol" w:cs="Times New Roman" w:hint="default"/>
+      </w:rPr>
+    </w:lvl>
+    <w:lvl w:ilvl="1" w:tplc="04090003" w:tentative="1">
+      <w:start w:val="1"/>
+      <w:numFmt w:val="bullet"/>
+      <w:lvlText w:val="o"/>
+      <w:lvlJc w:val="left"/>
+      <w:pPr>
+        <w:ind w:left="1800" w:hanging="360"/>
+      </w:pPr>
+      <w:rPr>
+        <w:rFonts w:ascii="Courier New" w:hAnsi="Courier New" w:cs="Courier New" w:hint="default"/>
+      </w:rPr>
+    </w:lvl>
+    <w:lvl w:ilvl="2" w:tplc="04090005" w:tentative="1">
+      <w:start w:val="1"/>
+      <w:numFmt w:val="bullet"/>
+      <w:lvlText w:val=""/>
+      <w:lvlJc w:val="left"/>
+      <w:pPr>
+        <w:ind w:left="2520" w:hanging="360"/>
+      </w:pPr>
+      <w:rPr>
+        <w:rFonts w:ascii="Wingdings" w:hAnsi="Wingdings" w:hint="default"/>
+      </w:rPr>
+    </w:lvl>
+    <w:lvl w:ilvl="3" w:tplc="04090001" w:tentative="1">
+      <w:start w:val="1"/>
+      <w:numFmt w:val="bullet"/>
+      <w:lvlText w:val=""/>
+      <w:lvlJc w:val="left"/>
+      <w:pPr>
+        <w:ind w:left="3240" w:hanging="360"/>
+      </w:pPr>
+      <w:rPr>
+        <w:rFonts w:ascii="Symbol" w:hAnsi="Symbol" w:hint="default"/>
+      </w:rPr>
+    </w:lvl>
+    <w:lvl w:ilvl="4" w:tplc="04090003" w:tentative="1">
+      <w:start w:val="1"/>
+      <w:numFmt w:val="bullet"/>
+      <w:lvlText w:val="o"/>
+      <w:lvlJc w:val="left"/>
+      <w:pPr>
+        <w:ind w:left="3960" w:hanging="360"/>
+      </w:pPr>
+      <w:rPr>
+        <w:rFonts w:ascii="Courier New" w:hAnsi="Courier New" w:cs="Courier New" w:hint="default"/>
+      </w:rPr>
+    </w:lvl>
+    <w:lvl w:ilvl="5" w:tplc="04090005" w:tentative="1">
+      <w:start w:val="1"/>
+      <w:numFmt w:val="bullet"/>
+      <w:lvlText w:val=""/>
+      <w:lvlJc w:val="left"/>
+      <w:pPr>
+        <w:ind w:left="4680" w:hanging="360"/>
+      </w:pPr>
+      <w:rPr>
+        <w:rFonts w:ascii="Wingdings" w:hAnsi="Wingdings" w:hint="default"/>
+      </w:rPr>
+    </w:lvl>
+    <w:lvl w:ilvl="6" w:tplc="04090001" w:tentative="1">
+      <w:start w:val="1"/>
+      <w:numFmt w:val="bullet"/>
+      <w:lvlText w:val=""/>
+      <w:lvlJc w:val="left"/>
+      <w:pPr>
+        <w:ind w:left="5400" w:hanging="360"/>
+      </w:pPr>
+      <w:rPr>
+        <w:rFonts w:ascii="Symbol" w:hAnsi="Symbol" w:hint="default"/>
+      </w:rPr>
+    </w:lvl>
+    <w:lvl w:ilvl="7" w:tplc="04090003" w:tentative="1">
+      <w:start w:val="1"/>
+      <w:numFmt w:val="bullet"/>
+      <w:lvlText w:val="o"/>
+      <w:lvlJc w:val="left"/>
+      <w:pPr>
+        <w:ind w:left="6120" w:hanging="360"/>
+      </w:pPr>
+      <w:rPr>
+        <w:rFonts w:ascii="Courier New" w:hAnsi="Courier New" w:cs="Courier New" w:hint="default"/>
+      </w:rPr>
+    </w:lvl>
+    <w:lvl w:ilvl="8" w:tplc="04090005" w:tentative="1">
+      <w:start w:val="1"/>
+      <w:numFmt w:val="bullet"/>
+      <w:lvlText w:val=""/>
+      <w:lvlJc w:val="left"/>
+      <w:pPr>
+        <w:ind w:left="6840" w:hanging="360"/>
+      </w:pPr>
+      <w:rPr>
+        <w:rFonts w:ascii="Wingdings" w:hAnsi="Wingdings" w:hint="default"/>
+      </w:rPr>
+    </w:lvl>
+  </w:abstractNum>
+  <w:abstractNum w:abstractNumId="4" w15:restartNumberingAfterBreak="0">
     <w:nsid w:val="73490624"/>
     <w:multiLevelType w:val="hybridMultilevel"/>
     <w:tmpl w:val="8F8A237E"/>
@@ -2999,6 +3156,9 @@
     <w:abstractNumId w:val="1"/>
   </w:num>
   <w:num w:numId="4" w16cid:durableId="1322537658">
+    <w:abstractNumId w:val="4"/>
+  </w:num>
+  <w:num w:numId="5" w16cid:durableId="1840121868">
     <w:abstractNumId w:val="3"/>
   </w:num>
 </w:numbering>
@@ -3473,6 +3633,17 @@
       <w:u w:val="single" w:color="FF9900"/>
     </w:rPr>
   </w:style>
+  <w:style w:type="paragraph" w:styleId="ListParagraph">
+    <w:name w:val="List Paragraph"/>
+    <w:basedOn w:val="Normal"/>
+    <w:uiPriority w:val="34"/>
+    <w:qFormat/>
+    <w:rsid w:val="008240EC"/>
+    <w:pPr>
+      <w:ind w:left="720"/>
+      <w:contextualSpacing/>
+    </w:pPr>
+  </w:style>
 </w:styles>
 </file>
 

</xml_diff>